<commit_message>
(docker) log file renamed on log flag command
</commit_message>
<xml_diff>
--- a/docs/3092883_CSP_Ass02_doc.docx
+++ b/docs/3092883_CSP_Ass02_doc.docx
@@ -5,6 +5,9 @@
     <w:bookmarkStart w:id="0" w:name="_Toc227870277" w:displacedByCustomXml="next"/>
     <w:sdt>
       <w:sdtPr>
+        <w:rPr>
+          <w:rFonts w:ascii="Times New Roman" w:hAnsi="Times New Roman" w:cs="Times New Roman"/>
+        </w:rPr>
         <w:id w:val="958926808"/>
         <w:docPartObj>
           <w:docPartGallery w:val="Table of Contents"/>
@@ -13,7 +16,7 @@
       </w:sdtPr>
       <w:sdtEndPr>
         <w:rPr>
-          <w:rFonts w:asciiTheme="minorHAnsi" w:eastAsiaTheme="minorHAnsi" w:hAnsiTheme="minorHAnsi" w:cstheme="minorBidi"/>
+          <w:rFonts w:eastAsiaTheme="minorHAnsi"/>
           <w:noProof/>
           <w:color w:val="auto"/>
           <w:kern w:val="2"/>
@@ -49,9 +52,8 @@
             <w:tabs>
               <w:tab w:val="right" w:leader="dot" w:pos="9628"/>
             </w:tabs>
-            <w:spacing w:line="360" w:lineRule="auto"/>
             <w:rPr>
-              <w:rFonts w:ascii="Times New Roman" w:eastAsiaTheme="minorEastAsia" w:hAnsi="Times New Roman" w:cs="Times New Roman"/>
+              <w:rFonts w:eastAsiaTheme="minorEastAsia"/>
               <w:b w:val="0"/>
               <w:bCs w:val="0"/>
               <w:i w:val="0"/>
@@ -82,7 +84,7 @@
             </w:rPr>
             <w:fldChar w:fldCharType="separate"/>
           </w:r>
-          <w:hyperlink w:anchor="_Toc227873223" w:history="1">
+          <w:hyperlink w:anchor="_Toc228022292" w:history="1">
             <w:r>
               <w:rPr>
                 <w:rStyle w:val="Hyperlink"/>
@@ -94,7 +96,6 @@
             </w:r>
             <w:r>
               <w:rPr>
-                <w:rFonts w:ascii="Times New Roman" w:hAnsi="Times New Roman" w:cs="Times New Roman"/>
                 <w:noProof/>
                 <w:webHidden/>
               </w:rPr>
@@ -102,7 +103,6 @@
             </w:r>
             <w:r>
               <w:rPr>
-                <w:rFonts w:ascii="Times New Roman" w:hAnsi="Times New Roman" w:cs="Times New Roman"/>
                 <w:noProof/>
                 <w:webHidden/>
               </w:rPr>
@@ -110,22 +110,19 @@
             </w:r>
             <w:r>
               <w:rPr>
-                <w:rFonts w:ascii="Times New Roman" w:hAnsi="Times New Roman" w:cs="Times New Roman"/>
-                <w:noProof/>
-                <w:webHidden/>
-              </w:rPr>
-              <w:instrText xml:space="preserve"> PAGEREF _Toc227873223 \h </w:instrText>
-            </w:r>
-            <w:r>
-              <w:rPr>
-                <w:rFonts w:ascii="Times New Roman" w:hAnsi="Times New Roman" w:cs="Times New Roman"/>
-                <w:noProof/>
-                <w:webHidden/>
-              </w:rPr>
-            </w:r>
-            <w:r>
-              <w:rPr>
-                <w:rFonts w:ascii="Times New Roman" w:hAnsi="Times New Roman" w:cs="Times New Roman"/>
+                <w:noProof/>
+                <w:webHidden/>
+              </w:rPr>
+              <w:instrText xml:space="preserve"> PAGEREF _Toc228022292 \h </w:instrText>
+            </w:r>
+            <w:r>
+              <w:rPr>
+                <w:noProof/>
+                <w:webHidden/>
+              </w:rPr>
+            </w:r>
+            <w:r>
+              <w:rPr>
                 <w:noProof/>
                 <w:webHidden/>
               </w:rPr>
@@ -133,7 +130,6 @@
             </w:r>
             <w:r>
               <w:rPr>
-                <w:rFonts w:ascii="Times New Roman" w:hAnsi="Times New Roman" w:cs="Times New Roman"/>
                 <w:noProof/>
                 <w:webHidden/>
               </w:rPr>
@@ -141,7 +137,6 @@
             </w:r>
             <w:r>
               <w:rPr>
-                <w:rFonts w:ascii="Times New Roman" w:hAnsi="Times New Roman" w:cs="Times New Roman"/>
                 <w:noProof/>
                 <w:webHidden/>
               </w:rPr>
@@ -155,9 +150,8 @@
             <w:tabs>
               <w:tab w:val="right" w:leader="dot" w:pos="9628"/>
             </w:tabs>
-            <w:spacing w:line="360" w:lineRule="auto"/>
             <w:rPr>
-              <w:rFonts w:ascii="Times New Roman" w:eastAsiaTheme="minorEastAsia" w:hAnsi="Times New Roman" w:cs="Times New Roman"/>
+              <w:rFonts w:eastAsiaTheme="minorEastAsia"/>
               <w:b w:val="0"/>
               <w:bCs w:val="0"/>
               <w:i w:val="0"/>
@@ -166,7 +160,7 @@
               <w:lang w:eastAsia="en-GB"/>
             </w:rPr>
           </w:pPr>
-          <w:hyperlink w:anchor="_Toc227873224" w:history="1">
+          <w:hyperlink w:anchor="_Toc228022293" w:history="1">
             <w:r>
               <w:rPr>
                 <w:rStyle w:val="Hyperlink"/>
@@ -178,7 +172,6 @@
             </w:r>
             <w:r>
               <w:rPr>
-                <w:rFonts w:ascii="Times New Roman" w:hAnsi="Times New Roman" w:cs="Times New Roman"/>
                 <w:noProof/>
                 <w:webHidden/>
               </w:rPr>
@@ -186,7 +179,6 @@
             </w:r>
             <w:r>
               <w:rPr>
-                <w:rFonts w:ascii="Times New Roman" w:hAnsi="Times New Roman" w:cs="Times New Roman"/>
                 <w:noProof/>
                 <w:webHidden/>
               </w:rPr>
@@ -194,22 +186,19 @@
             </w:r>
             <w:r>
               <w:rPr>
-                <w:rFonts w:ascii="Times New Roman" w:hAnsi="Times New Roman" w:cs="Times New Roman"/>
-                <w:noProof/>
-                <w:webHidden/>
-              </w:rPr>
-              <w:instrText xml:space="preserve"> PAGEREF _Toc227873224 \h </w:instrText>
-            </w:r>
-            <w:r>
-              <w:rPr>
-                <w:rFonts w:ascii="Times New Roman" w:hAnsi="Times New Roman" w:cs="Times New Roman"/>
-                <w:noProof/>
-                <w:webHidden/>
-              </w:rPr>
-            </w:r>
-            <w:r>
-              <w:rPr>
-                <w:rFonts w:ascii="Times New Roman" w:hAnsi="Times New Roman" w:cs="Times New Roman"/>
+                <w:noProof/>
+                <w:webHidden/>
+              </w:rPr>
+              <w:instrText xml:space="preserve"> PAGEREF _Toc228022293 \h </w:instrText>
+            </w:r>
+            <w:r>
+              <w:rPr>
+                <w:noProof/>
+                <w:webHidden/>
+              </w:rPr>
+            </w:r>
+            <w:r>
+              <w:rPr>
                 <w:noProof/>
                 <w:webHidden/>
               </w:rPr>
@@ -217,7 +206,6 @@
             </w:r>
             <w:r>
               <w:rPr>
-                <w:rFonts w:ascii="Times New Roman" w:hAnsi="Times New Roman" w:cs="Times New Roman"/>
                 <w:noProof/>
                 <w:webHidden/>
               </w:rPr>
@@ -225,7 +213,6 @@
             </w:r>
             <w:r>
               <w:rPr>
-                <w:rFonts w:ascii="Times New Roman" w:hAnsi="Times New Roman" w:cs="Times New Roman"/>
                 <w:noProof/>
                 <w:webHidden/>
               </w:rPr>
@@ -239,9 +226,8 @@
             <w:tabs>
               <w:tab w:val="right" w:leader="dot" w:pos="9628"/>
             </w:tabs>
-            <w:spacing w:line="360" w:lineRule="auto"/>
             <w:rPr>
-              <w:rFonts w:ascii="Times New Roman" w:eastAsiaTheme="minorEastAsia" w:hAnsi="Times New Roman" w:cs="Times New Roman"/>
+              <w:rFonts w:eastAsiaTheme="minorEastAsia"/>
               <w:b w:val="0"/>
               <w:bCs w:val="0"/>
               <w:noProof/>
@@ -250,84 +236,61 @@
               <w:lang w:eastAsia="en-GB"/>
             </w:rPr>
           </w:pPr>
-          <w:hyperlink w:anchor="_Toc227873225" w:history="1">
+          <w:hyperlink w:anchor="_Toc228022294" w:history="1">
             <w:r>
               <w:rPr>
                 <w:rStyle w:val="Hyperlink"/>
                 <w:rFonts w:ascii="Times New Roman" w:hAnsi="Times New Roman" w:cs="Times New Roman"/>
                 <w:noProof/>
-                <w:sz w:val="24"/>
-                <w:szCs w:val="24"/>
                 <w:lang w:val="en-US"/>
               </w:rPr>
               <w:t>2.1 List of Tech Stack</w:t>
             </w:r>
             <w:r>
               <w:rPr>
-                <w:rFonts w:ascii="Times New Roman" w:hAnsi="Times New Roman" w:cs="Times New Roman"/>
-                <w:noProof/>
-                <w:webHidden/>
-                <w:sz w:val="24"/>
-                <w:szCs w:val="24"/>
+                <w:noProof/>
+                <w:webHidden/>
               </w:rPr>
               <w:tab/>
             </w:r>
             <w:r>
               <w:rPr>
-                <w:rFonts w:ascii="Times New Roman" w:hAnsi="Times New Roman" w:cs="Times New Roman"/>
-                <w:noProof/>
-                <w:webHidden/>
-                <w:sz w:val="24"/>
-                <w:szCs w:val="24"/>
+                <w:noProof/>
+                <w:webHidden/>
               </w:rPr>
               <w:fldChar w:fldCharType="begin"/>
             </w:r>
             <w:r>
               <w:rPr>
-                <w:rFonts w:ascii="Times New Roman" w:hAnsi="Times New Roman" w:cs="Times New Roman"/>
-                <w:noProof/>
-                <w:webHidden/>
-                <w:sz w:val="24"/>
-                <w:szCs w:val="24"/>
-              </w:rPr>
-              <w:instrText xml:space="preserve"> PAGEREF _Toc227873225 \h </w:instrText>
-            </w:r>
-            <w:r>
-              <w:rPr>
-                <w:rFonts w:ascii="Times New Roman" w:hAnsi="Times New Roman" w:cs="Times New Roman"/>
-                <w:noProof/>
-                <w:webHidden/>
-                <w:sz w:val="24"/>
-                <w:szCs w:val="24"/>
-              </w:rPr>
-            </w:r>
-            <w:r>
-              <w:rPr>
-                <w:rFonts w:ascii="Times New Roman" w:hAnsi="Times New Roman" w:cs="Times New Roman"/>
-                <w:noProof/>
-                <w:webHidden/>
-                <w:sz w:val="24"/>
-                <w:szCs w:val="24"/>
+                <w:noProof/>
+                <w:webHidden/>
+              </w:rPr>
+              <w:instrText xml:space="preserve"> PAGEREF _Toc228022294 \h </w:instrText>
+            </w:r>
+            <w:r>
+              <w:rPr>
+                <w:noProof/>
+                <w:webHidden/>
+              </w:rPr>
+            </w:r>
+            <w:r>
+              <w:rPr>
+                <w:noProof/>
+                <w:webHidden/>
               </w:rPr>
               <w:fldChar w:fldCharType="separate"/>
             </w:r>
             <w:r>
               <w:rPr>
-                <w:rFonts w:ascii="Times New Roman" w:hAnsi="Times New Roman" w:cs="Times New Roman"/>
-                <w:noProof/>
-                <w:webHidden/>
-                <w:sz w:val="24"/>
-                <w:szCs w:val="24"/>
+                <w:noProof/>
+                <w:webHidden/>
               </w:rPr>
               <w:t>2</w:t>
             </w:r>
             <w:r>
               <w:rPr>
-                <w:rFonts w:ascii="Times New Roman" w:hAnsi="Times New Roman" w:cs="Times New Roman"/>
-                <w:noProof/>
-                <w:webHidden/>
-                <w:sz w:val="24"/>
-                <w:szCs w:val="24"/>
+                <w:noProof/>
+                <w:webHidden/>
               </w:rPr>
               <w:fldChar w:fldCharType="end"/>
             </w:r>
@@ -339,9 +302,8 @@
             <w:tabs>
               <w:tab w:val="right" w:leader="dot" w:pos="9628"/>
             </w:tabs>
-            <w:spacing w:line="360" w:lineRule="auto"/>
             <w:rPr>
-              <w:rFonts w:ascii="Times New Roman" w:eastAsiaTheme="minorEastAsia" w:hAnsi="Times New Roman" w:cs="Times New Roman"/>
+              <w:rFonts w:eastAsiaTheme="minorEastAsia"/>
               <w:b w:val="0"/>
               <w:bCs w:val="0"/>
               <w:noProof/>
@@ -350,84 +312,61 @@
               <w:lang w:eastAsia="en-GB"/>
             </w:rPr>
           </w:pPr>
-          <w:hyperlink w:anchor="_Toc227873226" w:history="1">
+          <w:hyperlink w:anchor="_Toc228022295" w:history="1">
             <w:r>
               <w:rPr>
                 <w:rStyle w:val="Hyperlink"/>
                 <w:rFonts w:ascii="Times New Roman" w:hAnsi="Times New Roman" w:cs="Times New Roman"/>
                 <w:noProof/>
-                <w:sz w:val="24"/>
-                <w:szCs w:val="24"/>
                 <w:lang w:val="en-US"/>
               </w:rPr>
               <w:t>2.2 Dependency management</w:t>
             </w:r>
             <w:r>
               <w:rPr>
-                <w:rFonts w:ascii="Times New Roman" w:hAnsi="Times New Roman" w:cs="Times New Roman"/>
-                <w:noProof/>
-                <w:webHidden/>
-                <w:sz w:val="24"/>
-                <w:szCs w:val="24"/>
+                <w:noProof/>
+                <w:webHidden/>
               </w:rPr>
               <w:tab/>
             </w:r>
             <w:r>
               <w:rPr>
-                <w:rFonts w:ascii="Times New Roman" w:hAnsi="Times New Roman" w:cs="Times New Roman"/>
-                <w:noProof/>
-                <w:webHidden/>
-                <w:sz w:val="24"/>
-                <w:szCs w:val="24"/>
+                <w:noProof/>
+                <w:webHidden/>
               </w:rPr>
               <w:fldChar w:fldCharType="begin"/>
             </w:r>
             <w:r>
               <w:rPr>
-                <w:rFonts w:ascii="Times New Roman" w:hAnsi="Times New Roman" w:cs="Times New Roman"/>
-                <w:noProof/>
-                <w:webHidden/>
-                <w:sz w:val="24"/>
-                <w:szCs w:val="24"/>
-              </w:rPr>
-              <w:instrText xml:space="preserve"> PAGEREF _Toc227873226 \h </w:instrText>
-            </w:r>
-            <w:r>
-              <w:rPr>
-                <w:rFonts w:ascii="Times New Roman" w:hAnsi="Times New Roman" w:cs="Times New Roman"/>
-                <w:noProof/>
-                <w:webHidden/>
-                <w:sz w:val="24"/>
-                <w:szCs w:val="24"/>
-              </w:rPr>
-            </w:r>
-            <w:r>
-              <w:rPr>
-                <w:rFonts w:ascii="Times New Roman" w:hAnsi="Times New Roman" w:cs="Times New Roman"/>
-                <w:noProof/>
-                <w:webHidden/>
-                <w:sz w:val="24"/>
-                <w:szCs w:val="24"/>
+                <w:noProof/>
+                <w:webHidden/>
+              </w:rPr>
+              <w:instrText xml:space="preserve"> PAGEREF _Toc228022295 \h </w:instrText>
+            </w:r>
+            <w:r>
+              <w:rPr>
+                <w:noProof/>
+                <w:webHidden/>
+              </w:rPr>
+            </w:r>
+            <w:r>
+              <w:rPr>
+                <w:noProof/>
+                <w:webHidden/>
               </w:rPr>
               <w:fldChar w:fldCharType="separate"/>
             </w:r>
             <w:r>
               <w:rPr>
-                <w:rFonts w:ascii="Times New Roman" w:hAnsi="Times New Roman" w:cs="Times New Roman"/>
-                <w:noProof/>
-                <w:webHidden/>
-                <w:sz w:val="24"/>
-                <w:szCs w:val="24"/>
+                <w:noProof/>
+                <w:webHidden/>
               </w:rPr>
               <w:t>3</w:t>
             </w:r>
             <w:r>
               <w:rPr>
-                <w:rFonts w:ascii="Times New Roman" w:hAnsi="Times New Roman" w:cs="Times New Roman"/>
-                <w:noProof/>
-                <w:webHidden/>
-                <w:sz w:val="24"/>
-                <w:szCs w:val="24"/>
+                <w:noProof/>
+                <w:webHidden/>
               </w:rPr>
               <w:fldChar w:fldCharType="end"/>
             </w:r>
@@ -439,9 +378,8 @@
             <w:tabs>
               <w:tab w:val="right" w:leader="dot" w:pos="9628"/>
             </w:tabs>
-            <w:spacing w:line="360" w:lineRule="auto"/>
             <w:rPr>
-              <w:rFonts w:ascii="Times New Roman" w:eastAsiaTheme="minorEastAsia" w:hAnsi="Times New Roman" w:cs="Times New Roman"/>
+              <w:rFonts w:eastAsiaTheme="minorEastAsia"/>
               <w:b w:val="0"/>
               <w:bCs w:val="0"/>
               <w:noProof/>
@@ -450,84 +388,61 @@
               <w:lang w:eastAsia="en-GB"/>
             </w:rPr>
           </w:pPr>
-          <w:hyperlink w:anchor="_Toc227873227" w:history="1">
+          <w:hyperlink w:anchor="_Toc228022296" w:history="1">
             <w:r>
               <w:rPr>
                 <w:rStyle w:val="Hyperlink"/>
                 <w:rFonts w:ascii="Times New Roman" w:hAnsi="Times New Roman" w:cs="Times New Roman"/>
                 <w:noProof/>
-                <w:sz w:val="24"/>
-                <w:szCs w:val="24"/>
                 <w:lang w:val="en-US"/>
               </w:rPr>
               <w:t>2.3 Data management</w:t>
             </w:r>
             <w:r>
               <w:rPr>
-                <w:rFonts w:ascii="Times New Roman" w:hAnsi="Times New Roman" w:cs="Times New Roman"/>
-                <w:noProof/>
-                <w:webHidden/>
-                <w:sz w:val="24"/>
-                <w:szCs w:val="24"/>
+                <w:noProof/>
+                <w:webHidden/>
               </w:rPr>
               <w:tab/>
             </w:r>
             <w:r>
               <w:rPr>
-                <w:rFonts w:ascii="Times New Roman" w:hAnsi="Times New Roman" w:cs="Times New Roman"/>
-                <w:noProof/>
-                <w:webHidden/>
-                <w:sz w:val="24"/>
-                <w:szCs w:val="24"/>
+                <w:noProof/>
+                <w:webHidden/>
               </w:rPr>
               <w:fldChar w:fldCharType="begin"/>
             </w:r>
             <w:r>
               <w:rPr>
-                <w:rFonts w:ascii="Times New Roman" w:hAnsi="Times New Roman" w:cs="Times New Roman"/>
-                <w:noProof/>
-                <w:webHidden/>
-                <w:sz w:val="24"/>
-                <w:szCs w:val="24"/>
-              </w:rPr>
-              <w:instrText xml:space="preserve"> PAGEREF _Toc227873227 \h </w:instrText>
-            </w:r>
-            <w:r>
-              <w:rPr>
-                <w:rFonts w:ascii="Times New Roman" w:hAnsi="Times New Roman" w:cs="Times New Roman"/>
-                <w:noProof/>
-                <w:webHidden/>
-                <w:sz w:val="24"/>
-                <w:szCs w:val="24"/>
-              </w:rPr>
-            </w:r>
-            <w:r>
-              <w:rPr>
-                <w:rFonts w:ascii="Times New Roman" w:hAnsi="Times New Roman" w:cs="Times New Roman"/>
-                <w:noProof/>
-                <w:webHidden/>
-                <w:sz w:val="24"/>
-                <w:szCs w:val="24"/>
+                <w:noProof/>
+                <w:webHidden/>
+              </w:rPr>
+              <w:instrText xml:space="preserve"> PAGEREF _Toc228022296 \h </w:instrText>
+            </w:r>
+            <w:r>
+              <w:rPr>
+                <w:noProof/>
+                <w:webHidden/>
+              </w:rPr>
+            </w:r>
+            <w:r>
+              <w:rPr>
+                <w:noProof/>
+                <w:webHidden/>
               </w:rPr>
               <w:fldChar w:fldCharType="separate"/>
             </w:r>
             <w:r>
               <w:rPr>
-                <w:rFonts w:ascii="Times New Roman" w:hAnsi="Times New Roman" w:cs="Times New Roman"/>
-                <w:noProof/>
-                <w:webHidden/>
-                <w:sz w:val="24"/>
-                <w:szCs w:val="24"/>
+                <w:noProof/>
+                <w:webHidden/>
               </w:rPr>
               <w:t>3</w:t>
             </w:r>
             <w:r>
               <w:rPr>
-                <w:rFonts w:ascii="Times New Roman" w:hAnsi="Times New Roman" w:cs="Times New Roman"/>
-                <w:noProof/>
-                <w:webHidden/>
-                <w:sz w:val="24"/>
-                <w:szCs w:val="24"/>
+                <w:noProof/>
+                <w:webHidden/>
               </w:rPr>
               <w:fldChar w:fldCharType="end"/>
             </w:r>
@@ -539,9 +454,8 @@
             <w:tabs>
               <w:tab w:val="right" w:leader="dot" w:pos="9628"/>
             </w:tabs>
-            <w:spacing w:line="360" w:lineRule="auto"/>
             <w:rPr>
-              <w:rFonts w:ascii="Times New Roman" w:eastAsiaTheme="minorEastAsia" w:hAnsi="Times New Roman" w:cs="Times New Roman"/>
+              <w:rFonts w:eastAsiaTheme="minorEastAsia"/>
               <w:b w:val="0"/>
               <w:bCs w:val="0"/>
               <w:i w:val="0"/>
@@ -550,7 +464,7 @@
               <w:lang w:eastAsia="en-GB"/>
             </w:rPr>
           </w:pPr>
-          <w:hyperlink w:anchor="_Toc227873228" w:history="1">
+          <w:hyperlink w:anchor="_Toc228022297" w:history="1">
             <w:r>
               <w:rPr>
                 <w:rStyle w:val="Hyperlink"/>
@@ -562,7 +476,6 @@
             </w:r>
             <w:r>
               <w:rPr>
-                <w:rFonts w:ascii="Times New Roman" w:hAnsi="Times New Roman" w:cs="Times New Roman"/>
                 <w:noProof/>
                 <w:webHidden/>
               </w:rPr>
@@ -570,7 +483,6 @@
             </w:r>
             <w:r>
               <w:rPr>
-                <w:rFonts w:ascii="Times New Roman" w:hAnsi="Times New Roman" w:cs="Times New Roman"/>
                 <w:noProof/>
                 <w:webHidden/>
               </w:rPr>
@@ -578,22 +490,19 @@
             </w:r>
             <w:r>
               <w:rPr>
-                <w:rFonts w:ascii="Times New Roman" w:hAnsi="Times New Roman" w:cs="Times New Roman"/>
-                <w:noProof/>
-                <w:webHidden/>
-              </w:rPr>
-              <w:instrText xml:space="preserve"> PAGEREF _Toc227873228 \h </w:instrText>
-            </w:r>
-            <w:r>
-              <w:rPr>
-                <w:rFonts w:ascii="Times New Roman" w:hAnsi="Times New Roman" w:cs="Times New Roman"/>
-                <w:noProof/>
-                <w:webHidden/>
-              </w:rPr>
-            </w:r>
-            <w:r>
-              <w:rPr>
-                <w:rFonts w:ascii="Times New Roman" w:hAnsi="Times New Roman" w:cs="Times New Roman"/>
+                <w:noProof/>
+                <w:webHidden/>
+              </w:rPr>
+              <w:instrText xml:space="preserve"> PAGEREF _Toc228022297 \h </w:instrText>
+            </w:r>
+            <w:r>
+              <w:rPr>
+                <w:noProof/>
+                <w:webHidden/>
+              </w:rPr>
+            </w:r>
+            <w:r>
+              <w:rPr>
                 <w:noProof/>
                 <w:webHidden/>
               </w:rPr>
@@ -601,7 +510,6 @@
             </w:r>
             <w:r>
               <w:rPr>
-                <w:rFonts w:ascii="Times New Roman" w:hAnsi="Times New Roman" w:cs="Times New Roman"/>
                 <w:noProof/>
                 <w:webHidden/>
               </w:rPr>
@@ -609,7 +517,6 @@
             </w:r>
             <w:r>
               <w:rPr>
-                <w:rFonts w:ascii="Times New Roman" w:hAnsi="Times New Roman" w:cs="Times New Roman"/>
                 <w:noProof/>
                 <w:webHidden/>
               </w:rPr>
@@ -623,9 +530,8 @@
             <w:tabs>
               <w:tab w:val="right" w:leader="dot" w:pos="9628"/>
             </w:tabs>
-            <w:spacing w:line="360" w:lineRule="auto"/>
             <w:rPr>
-              <w:rFonts w:ascii="Times New Roman" w:eastAsiaTheme="minorEastAsia" w:hAnsi="Times New Roman" w:cs="Times New Roman"/>
+              <w:rFonts w:eastAsiaTheme="minorEastAsia"/>
               <w:b w:val="0"/>
               <w:bCs w:val="0"/>
               <w:noProof/>
@@ -634,84 +540,61 @@
               <w:lang w:eastAsia="en-GB"/>
             </w:rPr>
           </w:pPr>
-          <w:hyperlink w:anchor="_Toc227873229" w:history="1">
+          <w:hyperlink w:anchor="_Toc228022298" w:history="1">
             <w:r>
               <w:rPr>
                 <w:rStyle w:val="Hyperlink"/>
                 <w:rFonts w:ascii="Times New Roman" w:hAnsi="Times New Roman" w:cs="Times New Roman"/>
                 <w:noProof/>
-                <w:sz w:val="24"/>
-                <w:szCs w:val="24"/>
                 <w:lang w:val="en-US"/>
               </w:rPr>
               <w:t>3.1 Naming Conventions</w:t>
             </w:r>
             <w:r>
               <w:rPr>
-                <w:rFonts w:ascii="Times New Roman" w:hAnsi="Times New Roman" w:cs="Times New Roman"/>
-                <w:noProof/>
-                <w:webHidden/>
-                <w:sz w:val="24"/>
-                <w:szCs w:val="24"/>
+                <w:noProof/>
+                <w:webHidden/>
               </w:rPr>
               <w:tab/>
             </w:r>
             <w:r>
               <w:rPr>
-                <w:rFonts w:ascii="Times New Roman" w:hAnsi="Times New Roman" w:cs="Times New Roman"/>
-                <w:noProof/>
-                <w:webHidden/>
-                <w:sz w:val="24"/>
-                <w:szCs w:val="24"/>
+                <w:noProof/>
+                <w:webHidden/>
               </w:rPr>
               <w:fldChar w:fldCharType="begin"/>
             </w:r>
             <w:r>
               <w:rPr>
-                <w:rFonts w:ascii="Times New Roman" w:hAnsi="Times New Roman" w:cs="Times New Roman"/>
-                <w:noProof/>
-                <w:webHidden/>
-                <w:sz w:val="24"/>
-                <w:szCs w:val="24"/>
-              </w:rPr>
-              <w:instrText xml:space="preserve"> PAGEREF _Toc227873229 \h </w:instrText>
-            </w:r>
-            <w:r>
-              <w:rPr>
-                <w:rFonts w:ascii="Times New Roman" w:hAnsi="Times New Roman" w:cs="Times New Roman"/>
-                <w:noProof/>
-                <w:webHidden/>
-                <w:sz w:val="24"/>
-                <w:szCs w:val="24"/>
-              </w:rPr>
-            </w:r>
-            <w:r>
-              <w:rPr>
-                <w:rFonts w:ascii="Times New Roman" w:hAnsi="Times New Roman" w:cs="Times New Roman"/>
-                <w:noProof/>
-                <w:webHidden/>
-                <w:sz w:val="24"/>
-                <w:szCs w:val="24"/>
+                <w:noProof/>
+                <w:webHidden/>
+              </w:rPr>
+              <w:instrText xml:space="preserve"> PAGEREF _Toc228022298 \h </w:instrText>
+            </w:r>
+            <w:r>
+              <w:rPr>
+                <w:noProof/>
+                <w:webHidden/>
+              </w:rPr>
+            </w:r>
+            <w:r>
+              <w:rPr>
+                <w:noProof/>
+                <w:webHidden/>
               </w:rPr>
               <w:fldChar w:fldCharType="separate"/>
             </w:r>
             <w:r>
               <w:rPr>
-                <w:rFonts w:ascii="Times New Roman" w:hAnsi="Times New Roman" w:cs="Times New Roman"/>
-                <w:noProof/>
-                <w:webHidden/>
-                <w:sz w:val="24"/>
-                <w:szCs w:val="24"/>
+                <w:noProof/>
+                <w:webHidden/>
               </w:rPr>
               <w:t>3</w:t>
             </w:r>
             <w:r>
               <w:rPr>
-                <w:rFonts w:ascii="Times New Roman" w:hAnsi="Times New Roman" w:cs="Times New Roman"/>
-                <w:noProof/>
-                <w:webHidden/>
-                <w:sz w:val="24"/>
-                <w:szCs w:val="24"/>
+                <w:noProof/>
+                <w:webHidden/>
               </w:rPr>
               <w:fldChar w:fldCharType="end"/>
             </w:r>
@@ -723,9 +606,8 @@
             <w:tabs>
               <w:tab w:val="right" w:leader="dot" w:pos="9628"/>
             </w:tabs>
-            <w:spacing w:line="360" w:lineRule="auto"/>
             <w:rPr>
-              <w:rFonts w:ascii="Times New Roman" w:eastAsiaTheme="minorEastAsia" w:hAnsi="Times New Roman" w:cs="Times New Roman"/>
+              <w:rFonts w:eastAsiaTheme="minorEastAsia"/>
               <w:b w:val="0"/>
               <w:bCs w:val="0"/>
               <w:noProof/>
@@ -734,84 +616,61 @@
               <w:lang w:eastAsia="en-GB"/>
             </w:rPr>
           </w:pPr>
-          <w:hyperlink w:anchor="_Toc227873230" w:history="1">
+          <w:hyperlink w:anchor="_Toc228022299" w:history="1">
             <w:r>
               <w:rPr>
                 <w:rStyle w:val="Hyperlink"/>
                 <w:rFonts w:ascii="Times New Roman" w:hAnsi="Times New Roman" w:cs="Times New Roman"/>
                 <w:noProof/>
-                <w:sz w:val="24"/>
-                <w:szCs w:val="24"/>
                 <w:lang w:val="en-US"/>
               </w:rPr>
               <w:t>3.2 Design Pattern</w:t>
             </w:r>
             <w:r>
               <w:rPr>
-                <w:rFonts w:ascii="Times New Roman" w:hAnsi="Times New Roman" w:cs="Times New Roman"/>
-                <w:noProof/>
-                <w:webHidden/>
-                <w:sz w:val="24"/>
-                <w:szCs w:val="24"/>
+                <w:noProof/>
+                <w:webHidden/>
               </w:rPr>
               <w:tab/>
             </w:r>
             <w:r>
               <w:rPr>
-                <w:rFonts w:ascii="Times New Roman" w:hAnsi="Times New Roman" w:cs="Times New Roman"/>
-                <w:noProof/>
-                <w:webHidden/>
-                <w:sz w:val="24"/>
-                <w:szCs w:val="24"/>
+                <w:noProof/>
+                <w:webHidden/>
               </w:rPr>
               <w:fldChar w:fldCharType="begin"/>
             </w:r>
             <w:r>
               <w:rPr>
-                <w:rFonts w:ascii="Times New Roman" w:hAnsi="Times New Roman" w:cs="Times New Roman"/>
-                <w:noProof/>
-                <w:webHidden/>
-                <w:sz w:val="24"/>
-                <w:szCs w:val="24"/>
-              </w:rPr>
-              <w:instrText xml:space="preserve"> PAGEREF _Toc227873230 \h </w:instrText>
-            </w:r>
-            <w:r>
-              <w:rPr>
-                <w:rFonts w:ascii="Times New Roman" w:hAnsi="Times New Roman" w:cs="Times New Roman"/>
-                <w:noProof/>
-                <w:webHidden/>
-                <w:sz w:val="24"/>
-                <w:szCs w:val="24"/>
-              </w:rPr>
-            </w:r>
-            <w:r>
-              <w:rPr>
-                <w:rFonts w:ascii="Times New Roman" w:hAnsi="Times New Roman" w:cs="Times New Roman"/>
-                <w:noProof/>
-                <w:webHidden/>
-                <w:sz w:val="24"/>
-                <w:szCs w:val="24"/>
+                <w:noProof/>
+                <w:webHidden/>
+              </w:rPr>
+              <w:instrText xml:space="preserve"> PAGEREF _Toc228022299 \h </w:instrText>
+            </w:r>
+            <w:r>
+              <w:rPr>
+                <w:noProof/>
+                <w:webHidden/>
+              </w:rPr>
+            </w:r>
+            <w:r>
+              <w:rPr>
+                <w:noProof/>
+                <w:webHidden/>
               </w:rPr>
               <w:fldChar w:fldCharType="separate"/>
             </w:r>
             <w:r>
               <w:rPr>
-                <w:rFonts w:ascii="Times New Roman" w:hAnsi="Times New Roman" w:cs="Times New Roman"/>
-                <w:noProof/>
-                <w:webHidden/>
-                <w:sz w:val="24"/>
-                <w:szCs w:val="24"/>
+                <w:noProof/>
+                <w:webHidden/>
               </w:rPr>
               <w:t>3</w:t>
             </w:r>
             <w:r>
               <w:rPr>
-                <w:rFonts w:ascii="Times New Roman" w:hAnsi="Times New Roman" w:cs="Times New Roman"/>
-                <w:noProof/>
-                <w:webHidden/>
-                <w:sz w:val="24"/>
-                <w:szCs w:val="24"/>
+                <w:noProof/>
+                <w:webHidden/>
               </w:rPr>
               <w:fldChar w:fldCharType="end"/>
             </w:r>
@@ -823,9 +682,8 @@
             <w:tabs>
               <w:tab w:val="right" w:leader="dot" w:pos="9628"/>
             </w:tabs>
-            <w:spacing w:line="360" w:lineRule="auto"/>
             <w:rPr>
-              <w:rFonts w:ascii="Times New Roman" w:eastAsiaTheme="minorEastAsia" w:hAnsi="Times New Roman" w:cs="Times New Roman"/>
+              <w:rFonts w:eastAsiaTheme="minorEastAsia"/>
               <w:b w:val="0"/>
               <w:bCs w:val="0"/>
               <w:i w:val="0"/>
@@ -834,7 +692,7 @@
               <w:lang w:eastAsia="en-GB"/>
             </w:rPr>
           </w:pPr>
-          <w:hyperlink w:anchor="_Toc227873231" w:history="1">
+          <w:hyperlink w:anchor="_Toc228022300" w:history="1">
             <w:r>
               <w:rPr>
                 <w:rStyle w:val="Hyperlink"/>
@@ -845,7 +703,6 @@
             </w:r>
             <w:r>
               <w:rPr>
-                <w:rFonts w:ascii="Times New Roman" w:hAnsi="Times New Roman" w:cs="Times New Roman"/>
                 <w:noProof/>
                 <w:webHidden/>
               </w:rPr>
@@ -853,7 +710,6 @@
             </w:r>
             <w:r>
               <w:rPr>
-                <w:rFonts w:ascii="Times New Roman" w:hAnsi="Times New Roman" w:cs="Times New Roman"/>
                 <w:noProof/>
                 <w:webHidden/>
               </w:rPr>
@@ -861,22 +717,19 @@
             </w:r>
             <w:r>
               <w:rPr>
-                <w:rFonts w:ascii="Times New Roman" w:hAnsi="Times New Roman" w:cs="Times New Roman"/>
-                <w:noProof/>
-                <w:webHidden/>
-              </w:rPr>
-              <w:instrText xml:space="preserve"> PAGEREF _Toc227873231 \h </w:instrText>
-            </w:r>
-            <w:r>
-              <w:rPr>
-                <w:rFonts w:ascii="Times New Roman" w:hAnsi="Times New Roman" w:cs="Times New Roman"/>
-                <w:noProof/>
-                <w:webHidden/>
-              </w:rPr>
-            </w:r>
-            <w:r>
-              <w:rPr>
-                <w:rFonts w:ascii="Times New Roman" w:hAnsi="Times New Roman" w:cs="Times New Roman"/>
+                <w:noProof/>
+                <w:webHidden/>
+              </w:rPr>
+              <w:instrText xml:space="preserve"> PAGEREF _Toc228022300 \h </w:instrText>
+            </w:r>
+            <w:r>
+              <w:rPr>
+                <w:noProof/>
+                <w:webHidden/>
+              </w:rPr>
+            </w:r>
+            <w:r>
+              <w:rPr>
                 <w:noProof/>
                 <w:webHidden/>
               </w:rPr>
@@ -884,7 +737,6 @@
             </w:r>
             <w:r>
               <w:rPr>
-                <w:rFonts w:ascii="Times New Roman" w:hAnsi="Times New Roman" w:cs="Times New Roman"/>
                 <w:noProof/>
                 <w:webHidden/>
               </w:rPr>
@@ -892,7 +744,6 @@
             </w:r>
             <w:r>
               <w:rPr>
-                <w:rFonts w:ascii="Times New Roman" w:hAnsi="Times New Roman" w:cs="Times New Roman"/>
                 <w:noProof/>
                 <w:webHidden/>
               </w:rPr>
@@ -906,9 +757,8 @@
             <w:tabs>
               <w:tab w:val="right" w:leader="dot" w:pos="9628"/>
             </w:tabs>
-            <w:spacing w:line="360" w:lineRule="auto"/>
             <w:rPr>
-              <w:rFonts w:ascii="Times New Roman" w:eastAsiaTheme="minorEastAsia" w:hAnsi="Times New Roman" w:cs="Times New Roman"/>
+              <w:rFonts w:eastAsiaTheme="minorEastAsia"/>
               <w:b w:val="0"/>
               <w:bCs w:val="0"/>
               <w:noProof/>
@@ -917,83 +767,60 @@
               <w:lang w:eastAsia="en-GB"/>
             </w:rPr>
           </w:pPr>
-          <w:hyperlink w:anchor="_Toc227873232" w:history="1">
+          <w:hyperlink w:anchor="_Toc228022301" w:history="1">
             <w:r>
               <w:rPr>
                 <w:rStyle w:val="Hyperlink"/>
                 <w:rFonts w:ascii="Times New Roman" w:hAnsi="Times New Roman" w:cs="Times New Roman"/>
                 <w:noProof/>
-                <w:sz w:val="24"/>
-                <w:szCs w:val="24"/>
               </w:rPr>
               <w:t>4.1 Relevant Functions</w:t>
             </w:r>
             <w:r>
               <w:rPr>
-                <w:rFonts w:ascii="Times New Roman" w:hAnsi="Times New Roman" w:cs="Times New Roman"/>
-                <w:noProof/>
-                <w:webHidden/>
-                <w:sz w:val="24"/>
-                <w:szCs w:val="24"/>
+                <w:noProof/>
+                <w:webHidden/>
               </w:rPr>
               <w:tab/>
             </w:r>
             <w:r>
               <w:rPr>
-                <w:rFonts w:ascii="Times New Roman" w:hAnsi="Times New Roman" w:cs="Times New Roman"/>
-                <w:noProof/>
-                <w:webHidden/>
-                <w:sz w:val="24"/>
-                <w:szCs w:val="24"/>
+                <w:noProof/>
+                <w:webHidden/>
               </w:rPr>
               <w:fldChar w:fldCharType="begin"/>
             </w:r>
             <w:r>
               <w:rPr>
-                <w:rFonts w:ascii="Times New Roman" w:hAnsi="Times New Roman" w:cs="Times New Roman"/>
-                <w:noProof/>
-                <w:webHidden/>
-                <w:sz w:val="24"/>
-                <w:szCs w:val="24"/>
-              </w:rPr>
-              <w:instrText xml:space="preserve"> PAGEREF _Toc227873232 \h </w:instrText>
-            </w:r>
-            <w:r>
-              <w:rPr>
-                <w:rFonts w:ascii="Times New Roman" w:hAnsi="Times New Roman" w:cs="Times New Roman"/>
-                <w:noProof/>
-                <w:webHidden/>
-                <w:sz w:val="24"/>
-                <w:szCs w:val="24"/>
-              </w:rPr>
-            </w:r>
-            <w:r>
-              <w:rPr>
-                <w:rFonts w:ascii="Times New Roman" w:hAnsi="Times New Roman" w:cs="Times New Roman"/>
-                <w:noProof/>
-                <w:webHidden/>
-                <w:sz w:val="24"/>
-                <w:szCs w:val="24"/>
+                <w:noProof/>
+                <w:webHidden/>
+              </w:rPr>
+              <w:instrText xml:space="preserve"> PAGEREF _Toc228022301 \h </w:instrText>
+            </w:r>
+            <w:r>
+              <w:rPr>
+                <w:noProof/>
+                <w:webHidden/>
+              </w:rPr>
+            </w:r>
+            <w:r>
+              <w:rPr>
+                <w:noProof/>
+                <w:webHidden/>
               </w:rPr>
               <w:fldChar w:fldCharType="separate"/>
             </w:r>
             <w:r>
               <w:rPr>
-                <w:rFonts w:ascii="Times New Roman" w:hAnsi="Times New Roman" w:cs="Times New Roman"/>
-                <w:noProof/>
-                <w:webHidden/>
-                <w:sz w:val="24"/>
-                <w:szCs w:val="24"/>
+                <w:noProof/>
+                <w:webHidden/>
               </w:rPr>
               <w:t>5</w:t>
             </w:r>
             <w:r>
               <w:rPr>
-                <w:rFonts w:ascii="Times New Roman" w:hAnsi="Times New Roman" w:cs="Times New Roman"/>
-                <w:noProof/>
-                <w:webHidden/>
-                <w:sz w:val="24"/>
-                <w:szCs w:val="24"/>
+                <w:noProof/>
+                <w:webHidden/>
               </w:rPr>
               <w:fldChar w:fldCharType="end"/>
             </w:r>
@@ -1005,9 +832,8 @@
             <w:tabs>
               <w:tab w:val="right" w:leader="dot" w:pos="9628"/>
             </w:tabs>
-            <w:spacing w:line="360" w:lineRule="auto"/>
             <w:rPr>
-              <w:rFonts w:ascii="Times New Roman" w:eastAsiaTheme="minorEastAsia" w:hAnsi="Times New Roman" w:cs="Times New Roman"/>
+              <w:rFonts w:eastAsiaTheme="minorEastAsia"/>
               <w:b w:val="0"/>
               <w:bCs w:val="0"/>
               <w:noProof/>
@@ -1016,83 +842,60 @@
               <w:lang w:eastAsia="en-GB"/>
             </w:rPr>
           </w:pPr>
-          <w:hyperlink w:anchor="_Toc227873233" w:history="1">
+          <w:hyperlink w:anchor="_Toc228022302" w:history="1">
             <w:r>
               <w:rPr>
                 <w:rStyle w:val="Hyperlink"/>
                 <w:rFonts w:ascii="Times New Roman" w:hAnsi="Times New Roman" w:cs="Times New Roman"/>
                 <w:noProof/>
-                <w:sz w:val="24"/>
-                <w:szCs w:val="24"/>
               </w:rPr>
               <w:t>4.2 Entity Schemas</w:t>
             </w:r>
             <w:r>
               <w:rPr>
-                <w:rFonts w:ascii="Times New Roman" w:hAnsi="Times New Roman" w:cs="Times New Roman"/>
-                <w:noProof/>
-                <w:webHidden/>
-                <w:sz w:val="24"/>
-                <w:szCs w:val="24"/>
+                <w:noProof/>
+                <w:webHidden/>
               </w:rPr>
               <w:tab/>
             </w:r>
             <w:r>
               <w:rPr>
-                <w:rFonts w:ascii="Times New Roman" w:hAnsi="Times New Roman" w:cs="Times New Roman"/>
-                <w:noProof/>
-                <w:webHidden/>
-                <w:sz w:val="24"/>
-                <w:szCs w:val="24"/>
+                <w:noProof/>
+                <w:webHidden/>
               </w:rPr>
               <w:fldChar w:fldCharType="begin"/>
             </w:r>
             <w:r>
               <w:rPr>
-                <w:rFonts w:ascii="Times New Roman" w:hAnsi="Times New Roman" w:cs="Times New Roman"/>
-                <w:noProof/>
-                <w:webHidden/>
-                <w:sz w:val="24"/>
-                <w:szCs w:val="24"/>
-              </w:rPr>
-              <w:instrText xml:space="preserve"> PAGEREF _Toc227873233 \h </w:instrText>
-            </w:r>
-            <w:r>
-              <w:rPr>
-                <w:rFonts w:ascii="Times New Roman" w:hAnsi="Times New Roman" w:cs="Times New Roman"/>
-                <w:noProof/>
-                <w:webHidden/>
-                <w:sz w:val="24"/>
-                <w:szCs w:val="24"/>
-              </w:rPr>
-            </w:r>
-            <w:r>
-              <w:rPr>
-                <w:rFonts w:ascii="Times New Roman" w:hAnsi="Times New Roman" w:cs="Times New Roman"/>
-                <w:noProof/>
-                <w:webHidden/>
-                <w:sz w:val="24"/>
-                <w:szCs w:val="24"/>
+                <w:noProof/>
+                <w:webHidden/>
+              </w:rPr>
+              <w:instrText xml:space="preserve"> PAGEREF _Toc228022302 \h </w:instrText>
+            </w:r>
+            <w:r>
+              <w:rPr>
+                <w:noProof/>
+                <w:webHidden/>
+              </w:rPr>
+            </w:r>
+            <w:r>
+              <w:rPr>
+                <w:noProof/>
+                <w:webHidden/>
               </w:rPr>
               <w:fldChar w:fldCharType="separate"/>
             </w:r>
             <w:r>
               <w:rPr>
-                <w:rFonts w:ascii="Times New Roman" w:hAnsi="Times New Roman" w:cs="Times New Roman"/>
-                <w:noProof/>
-                <w:webHidden/>
-                <w:sz w:val="24"/>
-                <w:szCs w:val="24"/>
+                <w:noProof/>
+                <w:webHidden/>
               </w:rPr>
               <w:t>6</w:t>
             </w:r>
             <w:r>
               <w:rPr>
-                <w:rFonts w:ascii="Times New Roman" w:hAnsi="Times New Roman" w:cs="Times New Roman"/>
-                <w:noProof/>
-                <w:webHidden/>
-                <w:sz w:val="24"/>
-                <w:szCs w:val="24"/>
+                <w:noProof/>
+                <w:webHidden/>
               </w:rPr>
               <w:fldChar w:fldCharType="end"/>
             </w:r>
@@ -1104,9 +907,8 @@
             <w:tabs>
               <w:tab w:val="right" w:leader="dot" w:pos="9628"/>
             </w:tabs>
-            <w:spacing w:line="360" w:lineRule="auto"/>
             <w:rPr>
-              <w:rFonts w:ascii="Times New Roman" w:eastAsiaTheme="minorEastAsia" w:hAnsi="Times New Roman" w:cs="Times New Roman"/>
+              <w:rFonts w:eastAsiaTheme="minorEastAsia"/>
               <w:b w:val="0"/>
               <w:bCs w:val="0"/>
               <w:noProof/>
@@ -1115,83 +917,135 @@
               <w:lang w:eastAsia="en-GB"/>
             </w:rPr>
           </w:pPr>
-          <w:hyperlink w:anchor="_Toc227873234" w:history="1">
+          <w:hyperlink w:anchor="_Toc228022303" w:history="1">
             <w:r>
               <w:rPr>
                 <w:rStyle w:val="Hyperlink"/>
                 <w:rFonts w:ascii="Times New Roman" w:hAnsi="Times New Roman" w:cs="Times New Roman"/>
                 <w:noProof/>
-                <w:sz w:val="24"/>
-                <w:szCs w:val="24"/>
               </w:rPr>
               <w:t>4.3 Frontend User Interactions Control</w:t>
             </w:r>
             <w:r>
               <w:rPr>
-                <w:rFonts w:ascii="Times New Roman" w:hAnsi="Times New Roman" w:cs="Times New Roman"/>
-                <w:noProof/>
-                <w:webHidden/>
-                <w:sz w:val="24"/>
-                <w:szCs w:val="24"/>
+                <w:noProof/>
+                <w:webHidden/>
               </w:rPr>
               <w:tab/>
             </w:r>
             <w:r>
               <w:rPr>
-                <w:rFonts w:ascii="Times New Roman" w:hAnsi="Times New Roman" w:cs="Times New Roman"/>
-                <w:noProof/>
-                <w:webHidden/>
-                <w:sz w:val="24"/>
-                <w:szCs w:val="24"/>
+                <w:noProof/>
+                <w:webHidden/>
               </w:rPr>
               <w:fldChar w:fldCharType="begin"/>
             </w:r>
             <w:r>
               <w:rPr>
-                <w:rFonts w:ascii="Times New Roman" w:hAnsi="Times New Roman" w:cs="Times New Roman"/>
-                <w:noProof/>
-                <w:webHidden/>
-                <w:sz w:val="24"/>
-                <w:szCs w:val="24"/>
-              </w:rPr>
-              <w:instrText xml:space="preserve"> PAGEREF _Toc227873234 \h </w:instrText>
-            </w:r>
-            <w:r>
-              <w:rPr>
-                <w:rFonts w:ascii="Times New Roman" w:hAnsi="Times New Roman" w:cs="Times New Roman"/>
-                <w:noProof/>
-                <w:webHidden/>
-                <w:sz w:val="24"/>
-                <w:szCs w:val="24"/>
-              </w:rPr>
-            </w:r>
-            <w:r>
-              <w:rPr>
-                <w:rFonts w:ascii="Times New Roman" w:hAnsi="Times New Roman" w:cs="Times New Roman"/>
-                <w:noProof/>
-                <w:webHidden/>
-                <w:sz w:val="24"/>
-                <w:szCs w:val="24"/>
+                <w:noProof/>
+                <w:webHidden/>
+              </w:rPr>
+              <w:instrText xml:space="preserve"> PAGEREF _Toc228022303 \h </w:instrText>
+            </w:r>
+            <w:r>
+              <w:rPr>
+                <w:noProof/>
+                <w:webHidden/>
+              </w:rPr>
+            </w:r>
+            <w:r>
+              <w:rPr>
+                <w:noProof/>
+                <w:webHidden/>
               </w:rPr>
               <w:fldChar w:fldCharType="separate"/>
             </w:r>
             <w:r>
               <w:rPr>
-                <w:rFonts w:ascii="Times New Roman" w:hAnsi="Times New Roman" w:cs="Times New Roman"/>
-                <w:noProof/>
-                <w:webHidden/>
-                <w:sz w:val="24"/>
-                <w:szCs w:val="24"/>
+                <w:noProof/>
+                <w:webHidden/>
               </w:rPr>
               <w:t>6</w:t>
             </w:r>
             <w:r>
               <w:rPr>
-                <w:rFonts w:ascii="Times New Roman" w:hAnsi="Times New Roman" w:cs="Times New Roman"/>
-                <w:noProof/>
-                <w:webHidden/>
-                <w:sz w:val="24"/>
-                <w:szCs w:val="24"/>
+                <w:noProof/>
+                <w:webHidden/>
+              </w:rPr>
+              <w:fldChar w:fldCharType="end"/>
+            </w:r>
+          </w:hyperlink>
+        </w:p>
+        <w:p>
+          <w:pPr>
+            <w:pStyle w:val="TOC2"/>
+            <w:tabs>
+              <w:tab w:val="right" w:leader="dot" w:pos="9628"/>
+            </w:tabs>
+            <w:rPr>
+              <w:rFonts w:eastAsiaTheme="minorEastAsia"/>
+              <w:b w:val="0"/>
+              <w:bCs w:val="0"/>
+              <w:noProof/>
+              <w:sz w:val="24"/>
+              <w:szCs w:val="24"/>
+              <w:lang w:eastAsia="en-GB"/>
+            </w:rPr>
+          </w:pPr>
+          <w:hyperlink w:anchor="_Toc228022304" w:history="1">
+            <w:r>
+              <w:rPr>
+                <w:rStyle w:val="Hyperlink"/>
+                <w:rFonts w:ascii="Times New Roman" w:hAnsi="Times New Roman" w:cs="Times New Roman"/>
+                <w:noProof/>
+              </w:rPr>
+              <w:t>4.4 Application Logs</w:t>
+            </w:r>
+            <w:r>
+              <w:rPr>
+                <w:noProof/>
+                <w:webHidden/>
+              </w:rPr>
+              <w:tab/>
+            </w:r>
+            <w:r>
+              <w:rPr>
+                <w:noProof/>
+                <w:webHidden/>
+              </w:rPr>
+              <w:fldChar w:fldCharType="begin"/>
+            </w:r>
+            <w:r>
+              <w:rPr>
+                <w:noProof/>
+                <w:webHidden/>
+              </w:rPr>
+              <w:instrText xml:space="preserve"> PAGEREF _Toc228022304 \h </w:instrText>
+            </w:r>
+            <w:r>
+              <w:rPr>
+                <w:noProof/>
+                <w:webHidden/>
+              </w:rPr>
+            </w:r>
+            <w:r>
+              <w:rPr>
+                <w:noProof/>
+                <w:webHidden/>
+              </w:rPr>
+              <w:fldChar w:fldCharType="separate"/>
+            </w:r>
+            <w:r>
+              <w:rPr>
+                <w:noProof/>
+                <w:webHidden/>
+              </w:rPr>
+              <w:t>6</w:t>
+            </w:r>
+            <w:r>
+              <w:rPr>
+                <w:noProof/>
+                <w:webHidden/>
               </w:rPr>
               <w:fldChar w:fldCharType="end"/>
             </w:r>
@@ -1203,9 +1057,8 @@
             <w:tabs>
               <w:tab w:val="right" w:leader="dot" w:pos="9628"/>
             </w:tabs>
-            <w:spacing w:line="360" w:lineRule="auto"/>
             <w:rPr>
-              <w:rFonts w:ascii="Times New Roman" w:eastAsiaTheme="minorEastAsia" w:hAnsi="Times New Roman" w:cs="Times New Roman"/>
+              <w:rFonts w:eastAsiaTheme="minorEastAsia"/>
               <w:b w:val="0"/>
               <w:bCs w:val="0"/>
               <w:i w:val="0"/>
@@ -1214,7 +1067,7 @@
               <w:lang w:eastAsia="en-GB"/>
             </w:rPr>
           </w:pPr>
-          <w:hyperlink w:anchor="_Toc227873235" w:history="1">
+          <w:hyperlink w:anchor="_Toc228022305" w:history="1">
             <w:r>
               <w:rPr>
                 <w:rStyle w:val="Hyperlink"/>
@@ -1225,7 +1078,6 @@
             </w:r>
             <w:r>
               <w:rPr>
-                <w:rFonts w:ascii="Times New Roman" w:hAnsi="Times New Roman" w:cs="Times New Roman"/>
                 <w:noProof/>
                 <w:webHidden/>
               </w:rPr>
@@ -1233,7 +1085,6 @@
             </w:r>
             <w:r>
               <w:rPr>
-                <w:rFonts w:ascii="Times New Roman" w:hAnsi="Times New Roman" w:cs="Times New Roman"/>
                 <w:noProof/>
                 <w:webHidden/>
               </w:rPr>
@@ -1241,22 +1092,19 @@
             </w:r>
             <w:r>
               <w:rPr>
-                <w:rFonts w:ascii="Times New Roman" w:hAnsi="Times New Roman" w:cs="Times New Roman"/>
-                <w:noProof/>
-                <w:webHidden/>
-              </w:rPr>
-              <w:instrText xml:space="preserve"> PAGEREF _Toc227873235 \h </w:instrText>
-            </w:r>
-            <w:r>
-              <w:rPr>
-                <w:rFonts w:ascii="Times New Roman" w:hAnsi="Times New Roman" w:cs="Times New Roman"/>
-                <w:noProof/>
-                <w:webHidden/>
-              </w:rPr>
-            </w:r>
-            <w:r>
-              <w:rPr>
-                <w:rFonts w:ascii="Times New Roman" w:hAnsi="Times New Roman" w:cs="Times New Roman"/>
+                <w:noProof/>
+                <w:webHidden/>
+              </w:rPr>
+              <w:instrText xml:space="preserve"> PAGEREF _Toc228022305 \h </w:instrText>
+            </w:r>
+            <w:r>
+              <w:rPr>
+                <w:noProof/>
+                <w:webHidden/>
+              </w:rPr>
+            </w:r>
+            <w:r>
+              <w:rPr>
                 <w:noProof/>
                 <w:webHidden/>
               </w:rPr>
@@ -1264,7 +1112,6 @@
             </w:r>
             <w:r>
               <w:rPr>
-                <w:rFonts w:ascii="Times New Roman" w:hAnsi="Times New Roman" w:cs="Times New Roman"/>
                 <w:noProof/>
                 <w:webHidden/>
               </w:rPr>
@@ -1272,7 +1119,6 @@
             </w:r>
             <w:r>
               <w:rPr>
-                <w:rFonts w:ascii="Times New Roman" w:hAnsi="Times New Roman" w:cs="Times New Roman"/>
                 <w:noProof/>
                 <w:webHidden/>
               </w:rPr>
@@ -1286,9 +1132,8 @@
             <w:tabs>
               <w:tab w:val="right" w:leader="dot" w:pos="9628"/>
             </w:tabs>
-            <w:spacing w:line="360" w:lineRule="auto"/>
             <w:rPr>
-              <w:rFonts w:ascii="Times New Roman" w:eastAsiaTheme="minorEastAsia" w:hAnsi="Times New Roman" w:cs="Times New Roman"/>
+              <w:rFonts w:eastAsiaTheme="minorEastAsia"/>
               <w:b w:val="0"/>
               <w:bCs w:val="0"/>
               <w:i w:val="0"/>
@@ -1297,7 +1142,7 @@
               <w:lang w:eastAsia="en-GB"/>
             </w:rPr>
           </w:pPr>
-          <w:hyperlink w:anchor="_Toc227873236" w:history="1">
+          <w:hyperlink w:anchor="_Toc228022306" w:history="1">
             <w:r>
               <w:rPr>
                 <w:rStyle w:val="Hyperlink"/>
@@ -1309,7 +1154,6 @@
             </w:r>
             <w:r>
               <w:rPr>
-                <w:rFonts w:ascii="Times New Roman" w:hAnsi="Times New Roman" w:cs="Times New Roman"/>
                 <w:noProof/>
                 <w:webHidden/>
               </w:rPr>
@@ -1317,7 +1161,6 @@
             </w:r>
             <w:r>
               <w:rPr>
-                <w:rFonts w:ascii="Times New Roman" w:hAnsi="Times New Roman" w:cs="Times New Roman"/>
                 <w:noProof/>
                 <w:webHidden/>
               </w:rPr>
@@ -1325,22 +1168,19 @@
             </w:r>
             <w:r>
               <w:rPr>
-                <w:rFonts w:ascii="Times New Roman" w:hAnsi="Times New Roman" w:cs="Times New Roman"/>
-                <w:noProof/>
-                <w:webHidden/>
-              </w:rPr>
-              <w:instrText xml:space="preserve"> PAGEREF _Toc227873236 \h </w:instrText>
-            </w:r>
-            <w:r>
-              <w:rPr>
-                <w:rFonts w:ascii="Times New Roman" w:hAnsi="Times New Roman" w:cs="Times New Roman"/>
-                <w:noProof/>
-                <w:webHidden/>
-              </w:rPr>
-            </w:r>
-            <w:r>
-              <w:rPr>
-                <w:rFonts w:ascii="Times New Roman" w:hAnsi="Times New Roman" w:cs="Times New Roman"/>
+                <w:noProof/>
+                <w:webHidden/>
+              </w:rPr>
+              <w:instrText xml:space="preserve"> PAGEREF _Toc228022306 \h </w:instrText>
+            </w:r>
+            <w:r>
+              <w:rPr>
+                <w:noProof/>
+                <w:webHidden/>
+              </w:rPr>
+            </w:r>
+            <w:r>
+              <w:rPr>
                 <w:noProof/>
                 <w:webHidden/>
               </w:rPr>
@@ -1348,7 +1188,6 @@
             </w:r>
             <w:r>
               <w:rPr>
-                <w:rFonts w:ascii="Times New Roman" w:hAnsi="Times New Roman" w:cs="Times New Roman"/>
                 <w:noProof/>
                 <w:webHidden/>
               </w:rPr>
@@ -1356,7 +1195,6 @@
             </w:r>
             <w:r>
               <w:rPr>
-                <w:rFonts w:ascii="Times New Roman" w:hAnsi="Times New Roman" w:cs="Times New Roman"/>
                 <w:noProof/>
                 <w:webHidden/>
               </w:rPr>
@@ -1367,6 +1205,9 @@
         <w:p>
           <w:pPr>
             <w:spacing w:line="360" w:lineRule="auto"/>
+            <w:rPr>
+              <w:rFonts w:ascii="Times New Roman" w:hAnsi="Times New Roman" w:cs="Times New Roman"/>
+            </w:rPr>
           </w:pPr>
           <w:r>
             <w:rPr>
@@ -1407,7 +1248,7 @@
           <w:lang w:val="en-US"/>
         </w:rPr>
       </w:pPr>
-      <w:bookmarkStart w:id="1" w:name="_Toc227873223"/>
+      <w:bookmarkStart w:id="1" w:name="_Toc228022292"/>
       <w:r>
         <w:rPr>
           <w:rFonts w:ascii="Times New Roman" w:hAnsi="Times New Roman" w:cs="Times New Roman"/>
@@ -1493,7 +1334,7 @@
         </w:rPr>
       </w:pPr>
       <w:bookmarkStart w:id="2" w:name="_Toc227870278"/>
-      <w:bookmarkStart w:id="3" w:name="_Toc227873224"/>
+      <w:bookmarkStart w:id="3" w:name="_Toc228022293"/>
       <w:r>
         <w:rPr>
           <w:rFonts w:ascii="Times New Roman" w:hAnsi="Times New Roman" w:cs="Times New Roman"/>
@@ -1538,7 +1379,7 @@
         </w:rPr>
       </w:pPr>
       <w:bookmarkStart w:id="4" w:name="_Toc227870279"/>
-      <w:bookmarkStart w:id="5" w:name="_Toc227873225"/>
+      <w:bookmarkStart w:id="5" w:name="_Toc228022294"/>
       <w:r>
         <w:rPr>
           <w:rFonts w:ascii="Times New Roman" w:hAnsi="Times New Roman" w:cs="Times New Roman"/>
@@ -1901,7 +1742,7 @@
         </w:rPr>
       </w:pPr>
       <w:bookmarkStart w:id="6" w:name="_Toc227870280"/>
-      <w:bookmarkStart w:id="7" w:name="_Toc227873226"/>
+      <w:bookmarkStart w:id="7" w:name="_Toc228022295"/>
       <w:r>
         <w:rPr>
           <w:rFonts w:ascii="Times New Roman" w:hAnsi="Times New Roman" w:cs="Times New Roman"/>
@@ -2012,7 +1853,7 @@
         </w:rPr>
       </w:pPr>
       <w:bookmarkStart w:id="8" w:name="_Toc227870281"/>
-      <w:bookmarkStart w:id="9" w:name="_Toc227873227"/>
+      <w:bookmarkStart w:id="9" w:name="_Toc228022296"/>
       <w:r>
         <w:rPr>
           <w:rFonts w:ascii="Times New Roman" w:hAnsi="Times New Roman" w:cs="Times New Roman"/>
@@ -2066,7 +1907,7 @@
         </w:rPr>
       </w:pPr>
       <w:bookmarkStart w:id="10" w:name="_Toc227870282"/>
-      <w:bookmarkStart w:id="11" w:name="_Toc227873228"/>
+      <w:bookmarkStart w:id="11" w:name="_Toc228022297"/>
       <w:r>
         <w:rPr>
           <w:rFonts w:ascii="Times New Roman" w:hAnsi="Times New Roman" w:cs="Times New Roman"/>
@@ -2192,7 +2033,7 @@
         </w:rPr>
       </w:pPr>
       <w:bookmarkStart w:id="12" w:name="_Toc227870283"/>
-      <w:bookmarkStart w:id="13" w:name="_Toc227873229"/>
+      <w:bookmarkStart w:id="13" w:name="_Toc228022298"/>
       <w:r>
         <w:rPr>
           <w:rFonts w:ascii="Times New Roman" w:hAnsi="Times New Roman" w:cs="Times New Roman"/>
@@ -2274,7 +2115,7 @@
         </w:rPr>
       </w:pPr>
       <w:bookmarkStart w:id="14" w:name="_Toc227870284"/>
-      <w:bookmarkStart w:id="15" w:name="_Toc227873230"/>
+      <w:bookmarkStart w:id="15" w:name="_Toc228022299"/>
       <w:r>
         <w:rPr>
           <w:rFonts w:ascii="Times New Roman" w:hAnsi="Times New Roman" w:cs="Times New Roman"/>
@@ -2787,7 +2628,7 @@
         </w:rPr>
       </w:pPr>
       <w:bookmarkStart w:id="16" w:name="_Toc227870285"/>
-      <w:bookmarkStart w:id="17" w:name="_Toc227873231"/>
+      <w:bookmarkStart w:id="17" w:name="_Toc228022300"/>
       <w:r>
         <w:rPr>
           <w:rFonts w:ascii="Times New Roman" w:hAnsi="Times New Roman" w:cs="Times New Roman"/>
@@ -2824,7 +2665,7 @@
         </w:rPr>
       </w:pPr>
       <w:bookmarkStart w:id="18" w:name="_Toc227870286"/>
-      <w:bookmarkStart w:id="19" w:name="_Toc227873232"/>
+      <w:bookmarkStart w:id="19" w:name="_Toc228022301"/>
       <w:r>
         <w:rPr>
           <w:rFonts w:ascii="Times New Roman" w:hAnsi="Times New Roman" w:cs="Times New Roman"/>
@@ -3505,23 +3346,21 @@
     </w:tbl>
     <w:p>
       <w:pPr>
+        <w:rPr>
+          <w:rFonts w:ascii="Times New Roman" w:hAnsi="Times New Roman" w:cs="Times New Roman"/>
+        </w:rPr>
+      </w:pPr>
+      <w:bookmarkStart w:id="20" w:name="_Toc227870287"/>
+    </w:p>
+    <w:p>
+      <w:pPr>
         <w:pStyle w:val="Heading2"/>
         <w:spacing w:line="360" w:lineRule="auto"/>
         <w:rPr>
           <w:rFonts w:ascii="Times New Roman" w:hAnsi="Times New Roman" w:cs="Times New Roman"/>
         </w:rPr>
       </w:pPr>
-      <w:bookmarkStart w:id="20" w:name="_Toc227870287"/>
-    </w:p>
-    <w:p>
-      <w:pPr>
-        <w:pStyle w:val="Heading2"/>
-        <w:spacing w:line="360" w:lineRule="auto"/>
-        <w:rPr>
-          <w:rFonts w:ascii="Times New Roman" w:hAnsi="Times New Roman" w:cs="Times New Roman"/>
-        </w:rPr>
-      </w:pPr>
-      <w:bookmarkStart w:id="21" w:name="_Toc227873233"/>
+      <w:bookmarkStart w:id="21" w:name="_Toc228022302"/>
       <w:r>
         <w:rPr>
           <w:rFonts w:ascii="Times New Roman" w:hAnsi="Times New Roman" w:cs="Times New Roman"/>
@@ -3714,7 +3553,7 @@
           <w:rFonts w:ascii="Times New Roman" w:hAnsi="Times New Roman" w:cs="Times New Roman"/>
         </w:rPr>
       </w:pPr>
-      <w:bookmarkStart w:id="22" w:name="_Toc227873234"/>
+      <w:bookmarkStart w:id="22" w:name="_Toc228022303"/>
       <w:r>
         <w:rPr>
           <w:rFonts w:ascii="Times New Roman" w:hAnsi="Times New Roman" w:cs="Times New Roman"/>
@@ -3779,31 +3618,73 @@
     </w:p>
     <w:p>
       <w:pPr>
+        <w:spacing w:line="360" w:lineRule="auto"/>
+        <w:rPr>
+          <w:rFonts w:ascii="Times New Roman" w:hAnsi="Times New Roman" w:cs="Times New Roman"/>
+        </w:rPr>
+      </w:pPr>
+    </w:p>
+    <w:p>
+      <w:pPr>
+        <w:pStyle w:val="Heading2"/>
+        <w:rPr>
+          <w:rFonts w:ascii="Times New Roman" w:hAnsi="Times New Roman" w:cs="Times New Roman"/>
+        </w:rPr>
+      </w:pPr>
+      <w:bookmarkStart w:id="23" w:name="_Toc228022304"/>
+      <w:r>
+        <w:rPr>
+          <w:rFonts w:ascii="Times New Roman" w:hAnsi="Times New Roman" w:cs="Times New Roman"/>
+        </w:rPr>
+        <w:t>4.4 Application Logs</w:t>
+      </w:r>
+      <w:bookmarkEnd w:id="23"/>
+    </w:p>
+    <w:p>
+      <w:pPr>
+        <w:rPr>
+          <w:rFonts w:ascii="Times New Roman" w:hAnsi="Times New Roman" w:cs="Times New Roman"/>
+        </w:rPr>
+      </w:pPr>
+      <w:r>
+        <w:rPr>
+          <w:rFonts w:ascii="Times New Roman" w:hAnsi="Times New Roman" w:cs="Times New Roman"/>
+        </w:rPr>
+        <w:t xml:space="preserve">On running the application and Azure service, both of their logs are saved into the .logs folder in the project folder as app.log and azure.log files. This will help to record and analyse what is happening </w:t>
+      </w:r>
+      <w:r>
+        <w:rPr>
+          <w:rFonts w:ascii="Times New Roman" w:hAnsi="Times New Roman" w:cs="Times New Roman"/>
+        </w:rPr>
+        <w:lastRenderedPageBreak/>
+        <w:t xml:space="preserve">when the user interacts with the application. In case of bugs or errors, these logs serve as the main source of identifying the error so that debugging them becomes much easier. </w:t>
+      </w:r>
+    </w:p>
+    <w:p>
+      <w:pPr>
+        <w:rPr>
+          <w:rFonts w:ascii="Times New Roman" w:hAnsi="Times New Roman" w:cs="Times New Roman"/>
+        </w:rPr>
+      </w:pPr>
+      <w:bookmarkStart w:id="24" w:name="_Toc227870288"/>
+    </w:p>
+    <w:p>
+      <w:pPr>
         <w:pStyle w:val="Heading1"/>
         <w:spacing w:line="360" w:lineRule="auto"/>
         <w:rPr>
           <w:rFonts w:ascii="Times New Roman" w:hAnsi="Times New Roman" w:cs="Times New Roman"/>
         </w:rPr>
       </w:pPr>
-      <w:bookmarkStart w:id="23" w:name="_Toc227870288"/>
-    </w:p>
-    <w:p>
-      <w:pPr>
-        <w:pStyle w:val="Heading1"/>
-        <w:spacing w:line="360" w:lineRule="auto"/>
-        <w:rPr>
-          <w:rFonts w:ascii="Times New Roman" w:hAnsi="Times New Roman" w:cs="Times New Roman"/>
-        </w:rPr>
-      </w:pPr>
-      <w:bookmarkStart w:id="24" w:name="_Toc227873235"/>
+      <w:bookmarkStart w:id="25" w:name="_Toc228022305"/>
       <w:r>
         <w:rPr>
           <w:rFonts w:ascii="Times New Roman" w:hAnsi="Times New Roman" w:cs="Times New Roman"/>
         </w:rPr>
         <w:t>5. Backend Endpoints</w:t>
       </w:r>
-      <w:bookmarkEnd w:id="23"/>
       <w:bookmarkEnd w:id="24"/>
+      <w:bookmarkEnd w:id="25"/>
       <w:r>
         <w:rPr>
           <w:rFonts w:ascii="Times New Roman" w:hAnsi="Times New Roman" w:cs="Times New Roman"/>
@@ -3912,7 +3793,7 @@
           <w:lang w:val="en-US"/>
         </w:rPr>
       </w:pPr>
-      <w:bookmarkStart w:id="25" w:name="_Toc227870289"/>
+      <w:bookmarkStart w:id="26" w:name="_Toc227870289"/>
       <w:r>
         <w:rPr>
           <w:rFonts w:ascii="Times New Roman" w:hAnsi="Times New Roman" w:cs="Times New Roman"/>
@@ -3929,7 +3810,7 @@
           <w:lang w:val="en-US"/>
         </w:rPr>
       </w:pPr>
-      <w:bookmarkStart w:id="26" w:name="_Toc227873236"/>
+      <w:bookmarkStart w:id="27" w:name="_Toc228022306"/>
       <w:r>
         <w:rPr>
           <w:rFonts w:ascii="Times New Roman" w:hAnsi="Times New Roman" w:cs="Times New Roman"/>
@@ -3938,8 +3819,8 @@
         <w:lastRenderedPageBreak/>
         <w:t>Appendix</w:t>
       </w:r>
-      <w:bookmarkEnd w:id="25"/>
       <w:bookmarkEnd w:id="26"/>
+      <w:bookmarkEnd w:id="27"/>
     </w:p>
     <w:p>
       <w:pPr>

</xml_diff>

<commit_message>
(doc) updated pdf doc and example env files
</commit_message>
<xml_diff>
--- a/docs/3092883_CSP_Ass02_doc.docx
+++ b/docs/3092883_CSP_Ass02_doc.docx
@@ -4019,6 +4019,88 @@
           <w:rFonts w:ascii="Times New Roman" w:hAnsi="Times New Roman" w:cs="Times New Roman"/>
         </w:rPr>
         <w:lastRenderedPageBreak/>
+        <w:t>Create folder modal</w:t>
+      </w:r>
+    </w:p>
+    <w:p>
+      <w:pPr>
+        <w:spacing w:line="360" w:lineRule="auto"/>
+        <w:rPr>
+          <w:rFonts w:ascii="Times New Roman" w:hAnsi="Times New Roman" w:cs="Times New Roman"/>
+        </w:rPr>
+      </w:pPr>
+      <w:r>
+        <w:rPr>
+          <w:rFonts w:ascii="Times New Roman" w:hAnsi="Times New Roman" w:cs="Times New Roman"/>
+          <w:noProof/>
+        </w:rPr>
+        <w:drawing>
+          <wp:inline distT="0" distB="0" distL="0" distR="0" wp14:anchorId="42F3BC1F" wp14:editId="4D8F11D2">
+            <wp:extent cx="6120130" cy="3415030"/>
+            <wp:effectExtent l="0" t="0" r="1270" b="1270"/>
+            <wp:docPr id="1530007455" name="Picture 6"/>
+            <wp:cNvGraphicFramePr>
+              <a:graphicFrameLocks xmlns:a="http://schemas.openxmlformats.org/drawingml/2006/main" noChangeAspect="1"/>
+            </wp:cNvGraphicFramePr>
+            <a:graphic xmlns:a="http://schemas.openxmlformats.org/drawingml/2006/main">
+              <a:graphicData uri="http://schemas.openxmlformats.org/drawingml/2006/picture">
+                <pic:pic xmlns:pic="http://schemas.openxmlformats.org/drawingml/2006/picture">
+                  <pic:nvPicPr>
+                    <pic:cNvPr id="1530007455" name="Picture 1530007455"/>
+                    <pic:cNvPicPr/>
+                  </pic:nvPicPr>
+                  <pic:blipFill>
+                    <a:blip r:embed="rId15" cstate="print">
+                      <a:extLst>
+                        <a:ext uri="{28A0092B-C50C-407E-A947-70E740481C1C}">
+                          <a14:useLocalDpi xmlns:a14="http://schemas.microsoft.com/office/drawing/2010/main" val="0"/>
+                        </a:ext>
+                      </a:extLst>
+                    </a:blip>
+                    <a:stretch>
+                      <a:fillRect/>
+                    </a:stretch>
+                  </pic:blipFill>
+                  <pic:spPr>
+                    <a:xfrm>
+                      <a:off x="0" y="0"/>
+                      <a:ext cx="6120130" cy="3415030"/>
+                    </a:xfrm>
+                    <a:prstGeom prst="rect">
+                      <a:avLst/>
+                    </a:prstGeom>
+                  </pic:spPr>
+                </pic:pic>
+              </a:graphicData>
+            </a:graphic>
+          </wp:inline>
+        </w:drawing>
+      </w:r>
+    </w:p>
+    <w:p>
+      <w:pPr>
+        <w:spacing w:line="360" w:lineRule="auto"/>
+        <w:rPr>
+          <w:rFonts w:ascii="Times New Roman" w:hAnsi="Times New Roman" w:cs="Times New Roman"/>
+        </w:rPr>
+      </w:pPr>
+    </w:p>
+    <w:p>
+      <w:pPr>
+        <w:pStyle w:val="ListParagraph"/>
+        <w:numPr>
+          <w:ilvl w:val="0"/>
+          <w:numId w:val="5"/>
+        </w:numPr>
+        <w:spacing w:line="360" w:lineRule="auto"/>
+        <w:rPr>
+          <w:rFonts w:ascii="Times New Roman" w:hAnsi="Times New Roman" w:cs="Times New Roman"/>
+        </w:rPr>
+      </w:pPr>
+      <w:r>
+        <w:rPr>
+          <w:rFonts w:ascii="Times New Roman" w:hAnsi="Times New Roman" w:cs="Times New Roman"/>
+        </w:rPr>
         <w:t xml:space="preserve">App workspace duplicate page UI </w:t>
       </w:r>
     </w:p>
@@ -4050,7 +4132,7 @@
                     <pic:cNvPicPr/>
                   </pic:nvPicPr>
                   <pic:blipFill>
-                    <a:blip r:embed="rId15" cstate="print">
+                    <a:blip r:embed="rId16" cstate="print">
                       <a:extLst>
                         <a:ext uri="{28A0092B-C50C-407E-A947-70E740481C1C}">
                           <a14:useLocalDpi xmlns:a14="http://schemas.microsoft.com/office/drawing/2010/main" val="0"/>
@@ -4078,8 +4160,8 @@
       </w:r>
     </w:p>
     <w:sectPr>
-      <w:headerReference w:type="default" r:id="rId16"/>
-      <w:footerReference w:type="default" r:id="rId17"/>
+      <w:headerReference w:type="default" r:id="rId17"/>
+      <w:footerReference w:type="default" r:id="rId18"/>
       <w:pgSz w:w="11906" w:h="16838"/>
       <w:pgMar w:top="1134" w:right="1134" w:bottom="1134" w:left="1134" w:header="709" w:footer="850" w:gutter="0"/>
       <w:cols w:space="720"/>

</xml_diff>